<commit_message>
3.A.13: gráficos del principal-agente con los textos explicativos de la PC y la IC dentro, como en la versión antigua, y al 85 % del ancho
Co-Authored-By: Claude Opus 5.5 <noreply@anthropic.com>
Claude-Session: https://claude.ai/code/session_01PWJgAjs4PN1Rvp3aLA4tqT
</commit_message>
<xml_diff>
--- a/oposicion/temario/tercer-ejercicio/3A13.docx
+++ b/oposicion/temario/tercer-ejercicio/3A13.docx
@@ -37,7 +37,7 @@
         <w:pStyle w:val="Paginasdeltema"/>
       </w:pPr>
       <w:r>
-        <w:t xml:space="preserve">Tema: 36 págs. · Anexos: 6 · Bibliografía: 5 (PDF)</w:t>
+        <w:t xml:space="preserve">Tema: 37 págs. · Anexos: 6 · Bibliografía: 5 (PDF)</w:t>
       </w:r>
     </w:p>
     <w:bookmarkStart w:id="35" w:name="introducci__n"/>
@@ -20598,7 +20598,7 @@
       <w:r>
         <w:drawing>
           <wp:inline>
-            <wp:extent cx="4178300" cy="2588144"/>
+            <wp:extent cx="5073650" cy="3142746"/>
             <wp:effectExtent b="0" l="0" r="0" t="0"/>
             <wp:docPr descr="Gráfico 15.– Principal-agente (a): esfuerzo observable con agente y principal neutrales; la PC coincide con una recta de isobeneficio y cualquier contrato sobre ella es óptimo" title="" id="159" name="Picture"/>
             <a:graphic>
@@ -20619,7 +20619,7 @@
                   <pic:spPr bwMode="auto">
                     <a:xfrm>
                       <a:off x="0" y="0"/>
-                      <a:ext cx="4178300" cy="2588144"/>
+                      <a:ext cx="5073650" cy="3142746"/>
                     </a:xfrm>
                     <a:prstGeom prst="rect">
                       <a:avLst/>
@@ -21187,7 +21187,7 @@
       <w:r>
         <w:drawing>
           <wp:inline>
-            <wp:extent cx="4178300" cy="2588144"/>
+            <wp:extent cx="5073650" cy="3142746"/>
             <wp:effectExtent b="0" l="0" r="0" t="0"/>
             <wp:docPr descr="Gráfico 16.– Principal-agente (b): esfuerzo observable con agente averso y principal neutral; pago fijo en Z, sobre la línea de certeza del agente" title="" id="165" name="Picture"/>
             <a:graphic>
@@ -21208,7 +21208,7 @@
                   <pic:spPr bwMode="auto">
                     <a:xfrm>
                       <a:off x="0" y="0"/>
-                      <a:ext cx="4178300" cy="2588144"/>
+                      <a:ext cx="5073650" cy="3142746"/>
                     </a:xfrm>
                     <a:prstGeom prst="rect">
                       <a:avLst/>
@@ -21831,7 +21831,7 @@
       <w:r>
         <w:drawing>
           <wp:inline>
-            <wp:extent cx="4178300" cy="2588144"/>
+            <wp:extent cx="5073650" cy="3142746"/>
             <wp:effectExtent b="0" l="0" r="0" t="0"/>
             <wp:docPr descr="Gráfico 17.– Principal-agente (c): esfuerzo observable con agente y principal aversos; la tangencia Z' (regla de Borch) reparte el riesgo entre los 2" title="" id="169" name="Picture"/>
             <a:graphic>
@@ -21852,7 +21852,7 @@
                   <pic:spPr bwMode="auto">
                     <a:xfrm>
                       <a:off x="0" y="0"/>
-                      <a:ext cx="4178300" cy="2588144"/>
+                      <a:ext cx="5073650" cy="3142746"/>
                     </a:xfrm>
                     <a:prstGeom prst="rect">
                       <a:avLst/>
@@ -24328,7 +24328,7 @@
       <w:r>
         <w:drawing>
           <wp:inline>
-            <wp:extent cx="4178300" cy="2588144"/>
+            <wp:extent cx="5073650" cy="3142746"/>
             <wp:effectExtent b="0" l="0" r="0" t="0"/>
             <wp:docPr descr="Gráfico 18.– Principal-agente (d): esfuerzo inobservable con agente y principal neutrales; los contratos de la PC que cumplen la IC, entre ellos la venta del negocio (V), siguen siendo óptimos" title="" id="177" name="Picture"/>
             <a:graphic>
@@ -24349,7 +24349,7 @@
                   <pic:spPr bwMode="auto">
                     <a:xfrm>
                       <a:off x="0" y="0"/>
-                      <a:ext cx="4178300" cy="2588144"/>
+                      <a:ext cx="5073650" cy="3142746"/>
                     </a:xfrm>
                     <a:prstGeom prst="rect">
                       <a:avLst/>
@@ -25744,7 +25744,7 @@
       <w:r>
         <w:drawing>
           <wp:inline>
-            <wp:extent cx="4178300" cy="2588144"/>
+            <wp:extent cx="5073650" cy="3142746"/>
             <wp:effectExtent b="0" l="0" r="0" t="0"/>
             <wp:docPr descr="Gráfico 19.– Principal-agente (e): esfuerzo inobservable con agente averso y principal neutral; la IC excluye Z y el contrato óptimo es T, con coste de agencia" title="" id="183" name="Picture"/>
             <a:graphic>
@@ -25765,7 +25765,7 @@
                   <pic:spPr bwMode="auto">
                     <a:xfrm>
                       <a:off x="0" y="0"/>
-                      <a:ext cx="4178300" cy="2588144"/>
+                      <a:ext cx="5073650" cy="3142746"/>
                     </a:xfrm>
                     <a:prstGeom prst="rect">
                       <a:avLst/>
@@ -51115,7 +51115,7 @@
       <w:jc w:val="both"/>
     </w:pPr>
     <w:rPr>
-      <w:rFonts w:ascii="Palatino Linotype" w:cs="Palatino Linotype" w:eastAsia="Palatino Linotype" w:hAnsi="Palatino Linotype"/>
+      <w:rFonts w:ascii="TeX Gyre Pagella" w:cs="TeX Gyre Pagella" w:eastAsia="TeX Gyre Pagella" w:hAnsi="TeX Gyre Pagella"/>
       <w:sz w:val="22"/>
     </w:rPr>
   </w:style>
@@ -51130,7 +51130,7 @@
       <w:jc w:val="both"/>
     </w:pPr>
     <w:rPr>
-      <w:rFonts w:ascii="Palatino Linotype" w:cs="Palatino Linotype" w:eastAsia="Palatino Linotype" w:hAnsi="Palatino Linotype"/>
+      <w:rFonts w:ascii="TeX Gyre Pagella" w:cs="TeX Gyre Pagella" w:eastAsia="TeX Gyre Pagella" w:hAnsi="TeX Gyre Pagella"/>
       <w:sz w:val="22"/>
     </w:rPr>
   </w:style>
@@ -51145,7 +51145,7 @@
       <w:jc w:val="both"/>
     </w:pPr>
     <w:rPr>
-      <w:rFonts w:ascii="Palatino Linotype" w:cs="Palatino Linotype" w:eastAsia="Palatino Linotype" w:hAnsi="Palatino Linotype"/>
+      <w:rFonts w:ascii="TeX Gyre Pagella" w:cs="TeX Gyre Pagella" w:eastAsia="TeX Gyre Pagella" w:hAnsi="TeX Gyre Pagella"/>
       <w:sz w:val="22"/>
     </w:rPr>
   </w:style>
@@ -51159,7 +51159,7 @@
       <w:jc w:val="both"/>
     </w:pPr>
     <w:rPr>
-      <w:rFonts w:ascii="Palatino Linotype" w:cs="Palatino Linotype" w:eastAsia="Palatino Linotype" w:hAnsi="Palatino Linotype"/>
+      <w:rFonts w:ascii="TeX Gyre Pagella" w:cs="TeX Gyre Pagella" w:eastAsia="TeX Gyre Pagella" w:hAnsi="TeX Gyre Pagella"/>
       <w:sz w:val="22"/>
     </w:rPr>
   </w:style>
@@ -51179,7 +51179,7 @@
       <w:jc w:val="center"/>
     </w:pPr>
     <w:rPr>
-      <w:rFonts w:ascii="Palatino Linotype" w:cs="Palatino Linotype" w:eastAsia="Palatino Linotype" w:hAnsi="Palatino Linotype"/>
+      <w:rFonts w:ascii="TeX Gyre Pagella" w:cs="TeX Gyre Pagella" w:eastAsia="TeX Gyre Pagella" w:hAnsi="TeX Gyre Pagella"/>
       <w:b/>
       <w:caps/>
       <w:color w:val="5F2987"/>
@@ -51214,7 +51214,7 @@
       <w:jc w:val="center"/>
     </w:pPr>
     <w:rPr>
-      <w:rFonts w:ascii="Palatino Linotype" w:cs="Palatino Linotype" w:eastAsia="Palatino Linotype" w:hAnsi="Palatino Linotype"/>
+      <w:rFonts w:ascii="TeX Gyre Pagella" w:cs="TeX Gyre Pagella" w:eastAsia="TeX Gyre Pagella" w:hAnsi="TeX Gyre Pagella"/>
       <w:b w:val="0"/>
       <w:i/>
       <w:caps w:val="0"/>
@@ -51249,7 +51249,7 @@
       <w:jc w:val="center"/>
     </w:pPr>
     <w:rPr>
-      <w:rFonts w:ascii="Palatino Linotype" w:cs="Palatino Linotype" w:eastAsia="Palatino Linotype" w:hAnsi="Palatino Linotype"/>
+      <w:rFonts w:ascii="TeX Gyre Pagella" w:cs="TeX Gyre Pagella" w:eastAsia="TeX Gyre Pagella" w:hAnsi="TeX Gyre Pagella"/>
       <w:b w:val="0"/>
       <w:i/>
       <w:caps w:val="0"/>
@@ -51270,7 +51270,7 @@
       <w:jc w:val="center"/>
     </w:pPr>
     <w:rPr>
-      <w:rFonts w:ascii="Palatino Linotype" w:cs="Palatino Linotype" w:eastAsia="Palatino Linotype" w:hAnsi="Palatino Linotype"/>
+      <w:rFonts w:ascii="TeX Gyre Pagella" w:cs="TeX Gyre Pagella" w:eastAsia="TeX Gyre Pagella" w:hAnsi="TeX Gyre Pagella"/>
       <w:b w:val="0"/>
       <w:i/>
       <w:caps w:val="0"/>
@@ -51318,7 +51318,7 @@
     <w:qFormat/>
     <w:pPr/>
     <w:rPr>
-      <w:rFonts w:ascii="Palatino Linotype" w:cs="Palatino Linotype" w:eastAsia="Palatino Linotype" w:hAnsi="Palatino Linotype"/>
+      <w:rFonts w:ascii="TeX Gyre Pagella" w:cs="TeX Gyre Pagella" w:eastAsia="TeX Gyre Pagella" w:hAnsi="TeX Gyre Pagella"/>
       <w:sz w:val="20"/>
     </w:rPr>
   </w:style>
@@ -51338,7 +51338,7 @@
       <w:shd w:color="auto" w:fill="5F2987" w:val="clear"/>
     </w:pPr>
     <w:rPr>
-      <w:rFonts w:ascii="Palatino Linotype" w:cs="Palatino Linotype" w:eastAsia="Palatino Linotype" w:hAnsi="Palatino Linotype"/>
+      <w:rFonts w:ascii="TeX Gyre Pagella" w:cs="TeX Gyre Pagella" w:eastAsia="TeX Gyre Pagella" w:hAnsi="TeX Gyre Pagella"/>
       <w:b/>
       <w:caps/>
       <w:color w:val="FFFFFF"/>
@@ -51366,7 +51366,7 @@
       </w:pBdr>
     </w:pPr>
     <w:rPr>
-      <w:rFonts w:ascii="Palatino Linotype" w:cs="Palatino Linotype" w:eastAsia="Palatino Linotype" w:hAnsi="Palatino Linotype"/>
+      <w:rFonts w:ascii="TeX Gyre Pagella" w:cs="TeX Gyre Pagella" w:eastAsia="TeX Gyre Pagella" w:hAnsi="TeX Gyre Pagella"/>
       <w:b/>
       <w:caps w:val="0"/>
       <w:color w:val="5F2987"/>
@@ -51392,7 +51392,7 @@
       <w:outlineLvl w:val="2"/>
     </w:pPr>
     <w:rPr>
-      <w:rFonts w:ascii="Palatino Linotype" w:cs="Palatino Linotype" w:eastAsia="Palatino Linotype" w:hAnsi="Palatino Linotype"/>
+      <w:rFonts w:ascii="TeX Gyre Pagella" w:cs="TeX Gyre Pagella" w:eastAsia="TeX Gyre Pagella" w:hAnsi="TeX Gyre Pagella"/>
       <w:b w:val="0"/>
       <w:i/>
       <w:color w:val="5F2987"/>
@@ -51418,7 +51418,7 @@
       <w:outlineLvl w:val="3"/>
     </w:pPr>
     <w:rPr>
-      <w:rFonts w:ascii="Palatino Linotype" w:cs="Palatino Linotype" w:eastAsia="Palatino Linotype" w:hAnsi="Palatino Linotype"/>
+      <w:rFonts w:ascii="TeX Gyre Pagella" w:cs="TeX Gyre Pagella" w:eastAsia="TeX Gyre Pagella" w:hAnsi="TeX Gyre Pagella"/>
       <w:b w:val="0"/>
       <w:i/>
       <w:iCs/>
@@ -51444,7 +51444,7 @@
       <w:outlineLvl w:val="4"/>
     </w:pPr>
     <w:rPr>
-      <w:rFonts w:ascii="Palatino Linotype" w:cs="Palatino Linotype" w:eastAsia="Palatino Linotype" w:hAnsi="Palatino Linotype"/>
+      <w:rFonts w:ascii="TeX Gyre Pagella" w:cs="TeX Gyre Pagella" w:eastAsia="TeX Gyre Pagella" w:hAnsi="TeX Gyre Pagella"/>
       <w:b w:val="0"/>
       <w:i/>
       <w:color w:val="4A1F6B"/>
@@ -51469,7 +51469,7 @@
       <w:outlineLvl w:val="5"/>
     </w:pPr>
     <w:rPr>
-      <w:rFonts w:ascii="Palatino Linotype" w:cs="Palatino Linotype" w:eastAsia="Palatino Linotype" w:hAnsi="Palatino Linotype"/>
+      <w:rFonts w:ascii="TeX Gyre Pagella" w:cs="TeX Gyre Pagella" w:eastAsia="TeX Gyre Pagella" w:hAnsi="TeX Gyre Pagella"/>
       <w:b w:val="0"/>
       <w:i/>
       <w:iCs/>
@@ -51681,7 +51681,7 @@
     <w:unhideWhenUsed/>
     <w:qFormat/>
     <w:rPr>
-      <w:rFonts w:ascii="Palatino Linotype" w:cs="Palatino Linotype" w:eastAsia="Palatino Linotype" w:hAnsi="Palatino Linotype"/>
+      <w:rFonts w:ascii="TeX Gyre Pagella" w:cs="TeX Gyre Pagella" w:eastAsia="TeX Gyre Pagella" w:hAnsi="TeX Gyre Pagella"/>
       <w:sz w:val="18"/>
     </w:rPr>
   </w:style>
@@ -51768,7 +51768,7 @@
       <w:jc w:val="center"/>
     </w:pPr>
     <w:rPr>
-      <w:rFonts w:ascii="Palatino Linotype" w:cs="Palatino Linotype" w:eastAsia="Palatino Linotype" w:hAnsi="Palatino Linotype"/>
+      <w:rFonts w:ascii="TeX Gyre Pagella" w:cs="TeX Gyre Pagella" w:eastAsia="TeX Gyre Pagella" w:hAnsi="TeX Gyre Pagella"/>
       <w:b w:val="0"/>
       <w:i w:val="0"/>
       <w:color w:val="5F2987"/>
@@ -51783,7 +51783,7 @@
       <w:jc w:val="center"/>
     </w:pPr>
     <w:rPr>
-      <w:rFonts w:ascii="Palatino Linotype" w:cs="Palatino Linotype" w:eastAsia="Palatino Linotype" w:hAnsi="Palatino Linotype"/>
+      <w:rFonts w:ascii="TeX Gyre Pagella" w:cs="TeX Gyre Pagella" w:eastAsia="TeX Gyre Pagella" w:hAnsi="TeX Gyre Pagella"/>
       <w:b w:val="0"/>
       <w:i w:val="0"/>
       <w:color w:val="5F2987"/>
@@ -51798,7 +51798,7 @@
       <w:jc w:val="center"/>
     </w:pPr>
     <w:rPr>
-      <w:rFonts w:ascii="Palatino Linotype" w:cs="Palatino Linotype" w:eastAsia="Palatino Linotype" w:hAnsi="Palatino Linotype"/>
+      <w:rFonts w:ascii="TeX Gyre Pagella" w:cs="TeX Gyre Pagella" w:eastAsia="TeX Gyre Pagella" w:hAnsi="TeX Gyre Pagella"/>
       <w:b w:val="0"/>
       <w:i w:val="0"/>
       <w:color w:val="5F2987"/>
@@ -51881,7 +51881,7 @@
       <w:shd w:color="auto" w:fill="F3EEF7" w:val="clear"/>
     </w:pPr>
     <w:rPr>
-      <w:rFonts w:ascii="Palatino Linotype" w:cs="Palatino Linotype" w:eastAsia="Palatino Linotype" w:hAnsi="Palatino Linotype"/>
+      <w:rFonts w:ascii="TeX Gyre Pagella" w:cs="TeX Gyre Pagella" w:eastAsia="TeX Gyre Pagella" w:hAnsi="TeX Gyre Pagella"/>
       <w:sz w:val="19"/>
     </w:rPr>
   </w:style>
@@ -51899,7 +51899,7 @@
       <w:shd w:color="auto" w:fill="E7E6E6" w:val="clear"/>
     </w:pPr>
     <w:rPr>
-      <w:rFonts w:ascii="Palatino Linotype" w:cs="Palatino Linotype" w:eastAsia="Palatino Linotype" w:hAnsi="Palatino Linotype"/>
+      <w:rFonts w:ascii="TeX Gyre Pagella" w:cs="TeX Gyre Pagella" w:eastAsia="TeX Gyre Pagella" w:hAnsi="TeX Gyre Pagella"/>
       <w:sz w:val="18"/>
     </w:rPr>
   </w:style>
@@ -51917,7 +51917,7 @@
       <w:shd w:color="auto" w:fill="E2EFD9" w:val="clear"/>
     </w:pPr>
     <w:rPr>
-      <w:rFonts w:ascii="Palatino Linotype" w:cs="Palatino Linotype" w:eastAsia="Palatino Linotype" w:hAnsi="Palatino Linotype"/>
+      <w:rFonts w:ascii="TeX Gyre Pagella" w:cs="TeX Gyre Pagella" w:eastAsia="TeX Gyre Pagella" w:hAnsi="TeX Gyre Pagella"/>
       <w:i/>
       <w:sz w:val="22"/>
     </w:rPr>
@@ -51936,7 +51936,7 @@
       <w:shd w:color="auto" w:fill="FAF9F6" w:val="clear"/>
     </w:pPr>
     <w:rPr>
-      <w:rFonts w:ascii="Palatino Linotype" w:cs="Palatino Linotype" w:eastAsia="Palatino Linotype" w:hAnsi="Palatino Linotype"/>
+      <w:rFonts w:ascii="TeX Gyre Pagella" w:cs="TeX Gyre Pagella" w:eastAsia="TeX Gyre Pagella" w:hAnsi="TeX Gyre Pagella"/>
       <w:sz w:val="20"/>
     </w:rPr>
   </w:style>
@@ -51948,7 +51948,7 @@
       <w:jc w:val="center"/>
     </w:pPr>
     <w:rPr>
-      <w:rFonts w:ascii="Palatino Linotype" w:cs="Palatino Linotype" w:eastAsia="Palatino Linotype" w:hAnsi="Palatino Linotype"/>
+      <w:rFonts w:ascii="TeX Gyre Pagella" w:cs="TeX Gyre Pagella" w:eastAsia="TeX Gyre Pagella" w:hAnsi="TeX Gyre Pagella"/>
       <w:i/>
       <w:color w:val="3B3838"/>
       <w:sz w:val="16"/>
@@ -51971,7 +51971,7 @@
       <w:shd w:color="auto" w:fill="F7F3FA" w:val="clear"/>
     </w:pPr>
     <w:rPr>
-      <w:rFonts w:ascii="Palatino Linotype" w:cs="Palatino Linotype" w:eastAsia="Palatino Linotype" w:hAnsi="Palatino Linotype"/>
+      <w:rFonts w:ascii="TeX Gyre Pagella" w:cs="TeX Gyre Pagella" w:eastAsia="TeX Gyre Pagella" w:hAnsi="TeX Gyre Pagella"/>
       <w:color w:val="5F2987"/>
       <w:sz w:val="22"/>
     </w:rPr>
@@ -51993,7 +51993,7 @@
       <w:jc w:val="center"/>
     </w:pPr>
     <w:rPr>
-      <w:rFonts w:ascii="Palatino Linotype" w:cs="Palatino Linotype" w:eastAsia="Palatino Linotype" w:hAnsi="Palatino Linotype"/>
+      <w:rFonts w:ascii="TeX Gyre Pagella" w:cs="TeX Gyre Pagella" w:eastAsia="TeX Gyre Pagella" w:hAnsi="TeX Gyre Pagella"/>
       <w:i/>
       <w:color w:val="767171"/>
       <w:sz w:val="18"/>
@@ -52024,7 +52024,7 @@
       <w:shd w:color="auto" w:fill="E2EFD9" w:val="clear"/>
     </w:pPr>
     <w:rPr>
-      <w:rFonts w:ascii="Palatino Linotype" w:cs="Palatino Linotype" w:eastAsia="Palatino Linotype" w:hAnsi="Palatino Linotype"/>
+      <w:rFonts w:ascii="TeX Gyre Pagella" w:cs="TeX Gyre Pagella" w:eastAsia="TeX Gyre Pagella" w:hAnsi="TeX Gyre Pagella"/>
       <w:sz w:val="20"/>
     </w:rPr>
   </w:style>
@@ -52038,7 +52038,7 @@
       <w:shd w:color="auto" w:fill="DDEBF7" w:val="clear"/>
     </w:pPr>
     <w:rPr>
-      <w:rFonts w:ascii="Palatino Linotype" w:cs="Palatino Linotype" w:eastAsia="Palatino Linotype" w:hAnsi="Palatino Linotype"/>
+      <w:rFonts w:ascii="TeX Gyre Pagella" w:cs="TeX Gyre Pagella" w:eastAsia="TeX Gyre Pagella" w:hAnsi="TeX Gyre Pagella"/>
       <w:sz w:val="20"/>
     </w:rPr>
   </w:style>
@@ -52052,7 +52052,7 @@
       <w:shd w:color="auto" w:fill="FBE4D5" w:val="clear"/>
     </w:pPr>
     <w:rPr>
-      <w:rFonts w:ascii="Palatino Linotype" w:cs="Palatino Linotype" w:eastAsia="Palatino Linotype" w:hAnsi="Palatino Linotype"/>
+      <w:rFonts w:ascii="TeX Gyre Pagella" w:cs="TeX Gyre Pagella" w:eastAsia="TeX Gyre Pagella" w:hAnsi="TeX Gyre Pagella"/>
       <w:sz w:val="20"/>
     </w:rPr>
   </w:style>
@@ -52066,7 +52066,7 @@
       <w:shd w:color="auto" w:fill="F3EEF7" w:val="clear"/>
     </w:pPr>
     <w:rPr>
-      <w:rFonts w:ascii="Palatino Linotype" w:cs="Palatino Linotype" w:eastAsia="Palatino Linotype" w:hAnsi="Palatino Linotype"/>
+      <w:rFonts w:ascii="TeX Gyre Pagella" w:cs="TeX Gyre Pagella" w:eastAsia="TeX Gyre Pagella" w:hAnsi="TeX Gyre Pagella"/>
       <w:sz w:val="20"/>
     </w:rPr>
   </w:style>
@@ -52080,7 +52080,7 @@
       <w:shd w:color="auto" w:fill="E7E6E6" w:val="clear"/>
     </w:pPr>
     <w:rPr>
-      <w:rFonts w:ascii="Palatino Linotype" w:cs="Palatino Linotype" w:eastAsia="Palatino Linotype" w:hAnsi="Palatino Linotype"/>
+      <w:rFonts w:ascii="TeX Gyre Pagella" w:cs="TeX Gyre Pagella" w:eastAsia="TeX Gyre Pagella" w:hAnsi="TeX Gyre Pagella"/>
       <w:sz w:val="20"/>
     </w:rPr>
   </w:style>
@@ -52094,7 +52094,7 @@
       <w:shd w:color="auto" w:fill="FAF9F6" w:val="clear"/>
     </w:pPr>
     <w:rPr>
-      <w:rFonts w:ascii="Palatino Linotype" w:cs="Palatino Linotype" w:eastAsia="Palatino Linotype" w:hAnsi="Palatino Linotype"/>
+      <w:rFonts w:ascii="TeX Gyre Pagella" w:cs="TeX Gyre Pagella" w:eastAsia="TeX Gyre Pagella" w:hAnsi="TeX Gyre Pagella"/>
       <w:sz w:val="20"/>
     </w:rPr>
   </w:style>
@@ -52108,7 +52108,7 @@
       <w:shd w:color="auto" w:fill="5F2987" w:val="clear"/>
     </w:pPr>
     <w:rPr>
-      <w:rFonts w:ascii="Palatino Linotype" w:cs="Palatino Linotype" w:eastAsia="Palatino Linotype" w:hAnsi="Palatino Linotype"/>
+      <w:rFonts w:ascii="TeX Gyre Pagella" w:cs="TeX Gyre Pagella" w:eastAsia="TeX Gyre Pagella" w:hAnsi="TeX Gyre Pagella"/>
       <w:color w:val="FFFFFF"/>
       <w:sz w:val="20"/>
     </w:rPr>
@@ -52123,7 +52123,7 @@
       <w:shd w:color="auto" w:fill="3C7D3A" w:val="clear"/>
     </w:pPr>
     <w:rPr>
-      <w:rFonts w:ascii="Palatino Linotype" w:cs="Palatino Linotype" w:eastAsia="Palatino Linotype" w:hAnsi="Palatino Linotype"/>
+      <w:rFonts w:ascii="TeX Gyre Pagella" w:cs="TeX Gyre Pagella" w:eastAsia="TeX Gyre Pagella" w:hAnsi="TeX Gyre Pagella"/>
       <w:color w:val="FFFFFF"/>
       <w:sz w:val="20"/>
     </w:rPr>
@@ -52138,7 +52138,7 @@
       <w:shd w:color="auto" w:fill="1F5F99" w:val="clear"/>
     </w:pPr>
     <w:rPr>
-      <w:rFonts w:ascii="Palatino Linotype" w:cs="Palatino Linotype" w:eastAsia="Palatino Linotype" w:hAnsi="Palatino Linotype"/>
+      <w:rFonts w:ascii="TeX Gyre Pagella" w:cs="TeX Gyre Pagella" w:eastAsia="TeX Gyre Pagella" w:hAnsi="TeX Gyre Pagella"/>
       <w:color w:val="FFFFFF"/>
       <w:sz w:val="20"/>
     </w:rPr>
@@ -52153,7 +52153,7 @@
       <w:shd w:color="auto" w:fill="B22222" w:val="clear"/>
     </w:pPr>
     <w:rPr>
-      <w:rFonts w:ascii="Palatino Linotype" w:cs="Palatino Linotype" w:eastAsia="Palatino Linotype" w:hAnsi="Palatino Linotype"/>
+      <w:rFonts w:ascii="TeX Gyre Pagella" w:cs="TeX Gyre Pagella" w:eastAsia="TeX Gyre Pagella" w:hAnsi="TeX Gyre Pagella"/>
       <w:color w:val="FFFFFF"/>
       <w:sz w:val="20"/>
     </w:rPr>
@@ -52168,7 +52168,7 @@
       <w:shd w:color="auto" w:fill="B8860B" w:val="clear"/>
     </w:pPr>
     <w:rPr>
-      <w:rFonts w:ascii="Palatino Linotype" w:cs="Palatino Linotype" w:eastAsia="Palatino Linotype" w:hAnsi="Palatino Linotype"/>
+      <w:rFonts w:ascii="TeX Gyre Pagella" w:cs="TeX Gyre Pagella" w:eastAsia="TeX Gyre Pagella" w:hAnsi="TeX Gyre Pagella"/>
       <w:color w:val="FFFFFF"/>
       <w:sz w:val="20"/>
     </w:rPr>
@@ -52183,7 +52183,7 @@
       <w:shd w:color="auto" w:fill="E07B28" w:val="clear"/>
     </w:pPr>
     <w:rPr>
-      <w:rFonts w:ascii="Palatino Linotype" w:cs="Palatino Linotype" w:eastAsia="Palatino Linotype" w:hAnsi="Palatino Linotype"/>
+      <w:rFonts w:ascii="TeX Gyre Pagella" w:cs="TeX Gyre Pagella" w:eastAsia="TeX Gyre Pagella" w:hAnsi="TeX Gyre Pagella"/>
       <w:color w:val="FFFFFF"/>
       <w:sz w:val="20"/>
     </w:rPr>
@@ -52198,7 +52198,7 @@
       <w:shd w:color="auto" w:fill="767171" w:val="clear"/>
     </w:pPr>
     <w:rPr>
-      <w:rFonts w:ascii="Palatino Linotype" w:cs="Palatino Linotype" w:eastAsia="Palatino Linotype" w:hAnsi="Palatino Linotype"/>
+      <w:rFonts w:ascii="TeX Gyre Pagella" w:cs="TeX Gyre Pagella" w:eastAsia="TeX Gyre Pagella" w:hAnsi="TeX Gyre Pagella"/>
       <w:color w:val="FFFFFF"/>
       <w:sz w:val="20"/>
     </w:rPr>

</xml_diff>